<commit_message>
Resume/CV: current seeded-defect counts; resume profile line matches the CV
Co-Authored-By: Claude Opus 5.5 <noreply@anthropic.com>
</commit_message>
<xml_diff>
--- a/careers/Patrick_Iben_Resume.docx
+++ b/careers/Patrick_Iben_Resume.docx
@@ -79,7 +79,7 @@
       <w:pPr/>
       <w:r>
         <w:rPr/>
-        <w:t>Applied mathematician and biostatistician with seven years in clinical biostatistics and twelve years in research. Works to eliminate needless ambiguity, risk, and suffering in decisions that rest on data. Builds statistical frameworks, AI-evaluation tools and public-data systems with traceable inputs and testable assumptions. Independent work includes six research manuscripts, scientific Python software, wearable sensing and 32 public-data consoles. Seeking research-scientist, research-engineering, AI-evaluation and biostatistical methods roles.</w:t>
+        <w:t>Applied mathematician and biostatistician with seven years in clinical biostatistics and twelve years in research. Works to eliminate needless ambiguity, risk, and suffering in decisions that rest on data. Builds statistical frameworks, AI-evaluation tools and public-data systems with traceable inputs and testable assumptions. Independent work includes six research manuscripts, scientific Python software, wearable sensing and 32 public-data consoles. Open to full-time and consulting roles.</w:t>
       </w:r>
     </w:p>
     <w:p>
@@ -447,7 +447,7 @@
       </w:hyperlink>
       <w:r>
         <w:rPr/>
-        <w:t xml:space="preserve"> with same-author recomputation and 18 pre-registered seeded defects (14 caught, 1 survived; not a detection rate); human sign-off pending.</w:t>
+        <w:t xml:space="preserve"> with same-author recomputation and 18 pre-registered seeded defects (15 caught, none survived; not a detection rate); human sign-off pending.</w:t>
       </w:r>
     </w:p>
     <w:p>

</xml_diff>